<commit_message>
Add changelog. Make pin guiding arcs printable.
</commit_message>
<xml_diff>
--- a/Karcsi_EE_changelog.docx
+++ b/Karcsi_EE_changelog.docx
@@ -111,7 +111,19 @@
         </w:numPr>
       </w:pPr>
       <w:r>
-        <w:t>Új motorok vétele, a régiek vezetékének cserélése</w:t>
+        <w:t>A</w:t>
+      </w:r>
+      <w:r>
+        <w:t xml:space="preserve"> </w:t>
+      </w:r>
+      <w:r>
+        <w:t>motorok</w:t>
+      </w:r>
+      <w:r>
+        <w:t xml:space="preserve"> vezetékének cser</w:t>
+      </w:r>
+      <w:r>
+        <w:t>éje</w:t>
       </w:r>
     </w:p>
     <w:p>
@@ -181,8 +193,8 @@
           <w:numId w:val="11"/>
         </w:numPr>
         <w:rPr>
-          <w:i/>
-          <w:iCs/>
+          <w:rStyle w:val="Erskiemels"/>
+          <w:color w:val="auto"/>
         </w:rPr>
       </w:pPr>
       <w:r>
@@ -208,13 +220,7 @@
         </w:rPr>
       </w:pPr>
       <w:r>
-        <w:rPr>
-          <w:rStyle w:val="Erskiemels"/>
-          <w:i w:val="0"/>
-          <w:iCs w:val="0"/>
-          <w:color w:val="auto"/>
-        </w:rPr>
-        <w:t>A fekete tenyér alkatrész hajoljon fölé a fehérnek és egy csavarral fogassuk át az egészet, emiatt a lilából kivágás</w:t>
+        <w:t>Új motorok vétele</w:t>
       </w:r>
     </w:p>
     <w:p>
@@ -225,8 +231,8 @@
           <w:numId w:val="11"/>
         </w:numPr>
         <w:rPr>
-          <w:rStyle w:val="Erskiemels"/>
-          <w:color w:val="auto"/>
+          <w:i/>
+          <w:iCs/>
         </w:rPr>
       </w:pPr>
       <w:r>
@@ -236,7 +242,7 @@
           <w:iCs w:val="0"/>
           <w:color w:val="auto"/>
         </w:rPr>
-        <w:t>A furatméreteket csapoknak és csavaroknak javítani</w:t>
+        <w:t>A fekete tenyér alkatrész hajoljon fölé a fehérnek és egy csavarral fogassuk át az egészet, emiatt a lilából kivágás</w:t>
       </w:r>
     </w:p>
     <w:p>
@@ -248,8 +254,6 @@
         </w:numPr>
         <w:rPr>
           <w:rStyle w:val="Erskiemels"/>
-          <w:i w:val="0"/>
-          <w:iCs w:val="0"/>
           <w:color w:val="auto"/>
         </w:rPr>
       </w:pPr>
@@ -260,16 +264,31 @@
           <w:iCs w:val="0"/>
           <w:color w:val="auto"/>
         </w:rPr>
-        <w:t>Megnézni, hogy fémből mennyiért nyomtatnak ilyet:</w:t>
-      </w:r>
-      <w:r>
+        <w:t>A furatméreteket csapoknak és csavaroknak javítani</w:t>
+      </w:r>
+    </w:p>
+    <w:p>
+      <w:pPr>
+        <w:pStyle w:val="Listaszerbekezds"/>
+        <w:numPr>
+          <w:ilvl w:val="0"/>
+          <w:numId w:val="11"/>
+        </w:numPr>
         <w:rPr>
           <w:rStyle w:val="Erskiemels"/>
           <w:i w:val="0"/>
           <w:iCs w:val="0"/>
           <w:color w:val="auto"/>
         </w:rPr>
-        <w:t xml:space="preserve"> </w:t>
+      </w:pPr>
+      <w:r>
+        <w:rPr>
+          <w:rStyle w:val="Erskiemels"/>
+          <w:i w:val="0"/>
+          <w:iCs w:val="0"/>
+          <w:color w:val="auto"/>
+        </w:rPr>
+        <w:t xml:space="preserve">Megnézni, hogy fémből mennyiért nyomtatnak ilyet: </w:t>
       </w:r>
       <w:r>
         <w:rPr>
@@ -440,6 +459,9 @@
       <w:r>
         <w:t>2025.01.26</w:t>
       </w:r>
+      <w:r>
+        <w:t xml:space="preserve"> – feature/br_end_effector</w:t>
+      </w:r>
     </w:p>
     <w:p>
       <w:pPr>
@@ -465,6 +487,9 @@
         <w:jc w:val="center"/>
       </w:pPr>
       <w:r>
+        <w:rPr>
+          <w:noProof/>
+        </w:rPr>
         <w:drawing>
           <wp:inline distT="0" distB="0" distL="0" distR="0" wp14:anchorId="0BC7D1C3" wp14:editId="61B5DEEC">
             <wp:extent cx="4541520" cy="3321537"/>
@@ -528,6 +553,9 @@
         <w:jc w:val="center"/>
       </w:pPr>
       <w:r>
+        <w:rPr>
+          <w:noProof/>
+        </w:rPr>
         <w:drawing>
           <wp:inline distT="0" distB="0" distL="0" distR="0" wp14:anchorId="0BF1B7E0" wp14:editId="6D88BF37">
             <wp:extent cx="5387059" cy="2590800"/>
@@ -588,6 +616,9 @@
         <w:jc w:val="center"/>
       </w:pPr>
       <w:r>
+        <w:rPr>
+          <w:noProof/>
+        </w:rPr>
         <w:lastRenderedPageBreak/>
         <w:drawing>
           <wp:inline distT="0" distB="0" distL="0" distR="0" wp14:anchorId="4C85E29E" wp14:editId="4B3CEA7C">
@@ -649,11 +680,14 @@
         <w:jc w:val="center"/>
       </w:pPr>
       <w:r>
+        <w:rPr>
+          <w:noProof/>
+        </w:rPr>
         <w:drawing>
-          <wp:inline distT="0" distB="0" distL="0" distR="0" wp14:anchorId="71518F64" wp14:editId="08641ECE">
-            <wp:extent cx="5760720" cy="2343785"/>
+          <wp:inline distT="0" distB="0" distL="0" distR="0" wp14:anchorId="1C900A70" wp14:editId="6AD3C4B3">
+            <wp:extent cx="5760720" cy="2297430"/>
             <wp:effectExtent l="0" t="0" r="0" b="0"/>
-            <wp:docPr id="2088239633" name="Kép 1" descr="A képen rajz, rajzfilm, vázlat, művészet látható&#10;&#10;Automatikusan generált leírás"/>
+            <wp:docPr id="1679879774" name="Kép 1" descr="A képen rajz, tervezés, vázlat, művészet látható&#10;&#10;Automatikusan generált leírás"/>
             <wp:cNvGraphicFramePr>
               <a:graphicFrameLocks xmlns:a="http://schemas.openxmlformats.org/drawingml/2006/main" noChangeAspect="1"/>
             </wp:cNvGraphicFramePr>
@@ -661,7 +695,7 @@
               <a:graphicData uri="http://schemas.openxmlformats.org/drawingml/2006/picture">
                 <pic:pic xmlns:pic="http://schemas.openxmlformats.org/drawingml/2006/picture">
                   <pic:nvPicPr>
-                    <pic:cNvPr id="2088239633" name="Kép 1" descr="A képen rajz, rajzfilm, vázlat, művészet látható&#10;&#10;Automatikusan generált leírás"/>
+                    <pic:cNvPr id="1679879774" name="Kép 1" descr="A képen rajz, tervezés, vázlat, művészet látható&#10;&#10;Automatikusan generált leírás"/>
                     <pic:cNvPicPr/>
                   </pic:nvPicPr>
                   <pic:blipFill>
@@ -673,7 +707,7 @@
                   <pic:spPr>
                     <a:xfrm>
                       <a:off x="0" y="0"/>
-                      <a:ext cx="5760720" cy="2343785"/>
+                      <a:ext cx="5760720" cy="2297430"/>
                     </a:xfrm>
                     <a:prstGeom prst="rect">
                       <a:avLst/>
@@ -709,6 +743,9 @@
         <w:jc w:val="center"/>
       </w:pPr>
       <w:r>
+        <w:rPr>
+          <w:noProof/>
+        </w:rPr>
         <w:lastRenderedPageBreak/>
         <w:drawing>
           <wp:inline distT="0" distB="0" distL="0" distR="0" wp14:anchorId="237A7463" wp14:editId="5B1F5AB2">
@@ -773,6 +810,9 @@
         <w:jc w:val="center"/>
       </w:pPr>
       <w:r>
+        <w:rPr>
+          <w:noProof/>
+        </w:rPr>
         <w:drawing>
           <wp:inline distT="0" distB="0" distL="0" distR="0" wp14:anchorId="31AC7CF2" wp14:editId="18826C56">
             <wp:extent cx="5760720" cy="4399915"/>
@@ -857,6 +897,9 @@
         <w:jc w:val="center"/>
       </w:pPr>
       <w:r>
+        <w:rPr>
+          <w:noProof/>
+        </w:rPr>
         <w:drawing>
           <wp:inline distT="0" distB="0" distL="0" distR="0" wp14:anchorId="3E1C5A15" wp14:editId="01282952">
             <wp:extent cx="4183380" cy="3499523"/>
@@ -920,11 +963,14 @@
         <w:jc w:val="center"/>
       </w:pPr>
       <w:r>
+        <w:rPr>
+          <w:noProof/>
+        </w:rPr>
         <w:drawing>
-          <wp:inline distT="0" distB="0" distL="0" distR="0" wp14:anchorId="552E6C47" wp14:editId="0B614CF0">
-            <wp:extent cx="4892040" cy="1774119"/>
+          <wp:inline distT="0" distB="0" distL="0" distR="0" wp14:anchorId="20877BF2" wp14:editId="426893E4">
+            <wp:extent cx="5760720" cy="2202180"/>
             <wp:effectExtent l="0" t="0" r="0" b="0"/>
-            <wp:docPr id="613881520" name="Kép 1" descr="A képen képernyőkép, tervezés látható&#10;&#10;Automatikusan generált leírás"/>
+            <wp:docPr id="1646851828" name="Kép 1" descr="A képen rajzfilm, képernyőkép, tervezés látható&#10;&#10;Automatikusan generált leírás"/>
             <wp:cNvGraphicFramePr>
               <a:graphicFrameLocks xmlns:a="http://schemas.openxmlformats.org/drawingml/2006/main" noChangeAspect="1"/>
             </wp:cNvGraphicFramePr>
@@ -932,7 +978,7 @@
               <a:graphicData uri="http://schemas.openxmlformats.org/drawingml/2006/picture">
                 <pic:pic xmlns:pic="http://schemas.openxmlformats.org/drawingml/2006/picture">
                   <pic:nvPicPr>
-                    <pic:cNvPr id="613881520" name="Kép 1" descr="A képen képernyőkép, tervezés látható&#10;&#10;Automatikusan generált leírás"/>
+                    <pic:cNvPr id="1646851828" name="Kép 1" descr="A képen rajzfilm, képernyőkép, tervezés látható&#10;&#10;Automatikusan generált leírás"/>
                     <pic:cNvPicPr/>
                   </pic:nvPicPr>
                   <pic:blipFill>
@@ -944,7 +990,7 @@
                   <pic:spPr>
                     <a:xfrm>
                       <a:off x="0" y="0"/>
-                      <a:ext cx="4899694" cy="1776895"/>
+                      <a:ext cx="5760720" cy="2202180"/>
                     </a:xfrm>
                     <a:prstGeom prst="rect">
                       <a:avLst/>
@@ -986,6 +1032,9 @@
         <w:br w:type="page"/>
       </w:r>
       <w:r>
+        <w:rPr>
+          <w:noProof/>
+        </w:rPr>
         <w:lastRenderedPageBreak/>
         <w:drawing>
           <wp:inline distT="0" distB="0" distL="0" distR="0" wp14:anchorId="6835E731" wp14:editId="624F3BA5">
@@ -1071,6 +1120,9 @@
         <w:jc w:val="center"/>
       </w:pPr>
       <w:r>
+        <w:rPr>
+          <w:noProof/>
+        </w:rPr>
         <w:drawing>
           <wp:inline distT="0" distB="0" distL="0" distR="0" wp14:anchorId="4F5C8CCE" wp14:editId="06475F15">
             <wp:extent cx="3291079" cy="4358640"/>
@@ -1158,6 +1210,9 @@
         <w:jc w:val="center"/>
       </w:pPr>
       <w:r>
+        <w:rPr>
+          <w:noProof/>
+        </w:rPr>
         <w:drawing>
           <wp:inline distT="0" distB="0" distL="0" distR="0" wp14:anchorId="51C9DE2A" wp14:editId="05439F26">
             <wp:extent cx="5760720" cy="3168650"/>
@@ -1218,6 +1273,9 @@
         <w:jc w:val="center"/>
       </w:pPr>
       <w:r>
+        <w:rPr>
+          <w:noProof/>
+        </w:rPr>
         <w:drawing>
           <wp:inline distT="0" distB="0" distL="0" distR="0" wp14:anchorId="7BB02B20" wp14:editId="6AFE3422">
             <wp:extent cx="5760720" cy="2894330"/>
@@ -1281,6 +1339,9 @@
         <w:jc w:val="center"/>
       </w:pPr>
       <w:r>
+        <w:rPr>
+          <w:noProof/>
+        </w:rPr>
         <w:lastRenderedPageBreak/>
         <w:drawing>
           <wp:inline distT="0" distB="0" distL="0" distR="0" wp14:anchorId="3F583017" wp14:editId="61F5D73F">
@@ -1345,6 +1406,9 @@
         <w:jc w:val="center"/>
       </w:pPr>
       <w:r>
+        <w:rPr>
+          <w:noProof/>
+        </w:rPr>
         <w:drawing>
           <wp:inline distT="0" distB="0" distL="0" distR="0" wp14:anchorId="73B67680" wp14:editId="41F8A2B0">
             <wp:extent cx="5760720" cy="2941955"/>

</xml_diff>